<commit_message>
docs(milestone): fill governance framework placeholders
Executive Sponsor: Cameron Taggart (Sayer)
Executive Stakeholder: Jason Wise (Milestone, dual role with Project Champion)

Co-Authored-By: Claude Opus 4.6 (1M context) <noreply@anthropic.com>
</commit_message>
<xml_diff>
--- a/MilestoneSoW/Milestone_Governance_Framework.docx
+++ b/MilestoneSoW/Milestone_Governance_Framework.docx
@@ -555,7 +555,7 @@
                 <w:sz w:val="22"/>
                 <w:szCs w:val="22"/>
               </w:rPr>
-              <w:t xml:space="preserve">[Executive Sponsor]</w:t>
+              <w:t xml:space="preserve">Cameron Taggart</w:t>
             </w:r>
           </w:p>
         </w:tc>
@@ -1136,7 +1136,7 @@
                 <w:sz w:val="22"/>
                 <w:szCs w:val="22"/>
               </w:rPr>
-              <w:t xml:space="preserve">[Executive Stakeholder]</w:t>
+              <w:t xml:space="preserve">Jason Wise</w:t>
             </w:r>
           </w:p>
         </w:tc>
@@ -1276,7 +1276,7 @@
           <w:sz w:val="22"/>
           <w:szCs w:val="22"/>
         </w:rPr>
-        <w:t xml:space="preserve">[Executive Sponsor], Sayer Executive Sponsor</w:t>
+        <w:t xml:space="preserve">Cameron Taggart, Sayer Executive Sponsor</w:t>
       </w:r>
     </w:p>
     <w:p>

</xml_diff>